<commit_message>
Remove dedicated Taiwan wording from requirements
</commit_message>
<xml_diff>
--- a/docs/全球黄金迁徙地图上线需求.docx
+++ b/docs/全球黄金迁徙地图上线需求.docx
@@ -60,7 +60,7 @@
     </w:p>
     <w:p>
       <w:r>
-        <w:t>当前demo是固定快照，尚无自动定时任务。下文频次是技术需要实现的安排，默认北京时间，注明当地时间的按当地工作日和夏令时执行。各卡片标真实观测期；历史数据不参与当前趋势。当前demo未接AI，上线不强制采用；可选AI仅润色规则先得出的结论。页面、列表、地图、筛选和文案统一使用中国台湾。</w:t>
+        <w:t>当前demo是固定快照，尚无自动定时任务。下文频次是技术需要实现的安排，默认北京时间，注明当地时间的按当地工作日和夏令时执行。各卡片标真实观测期；历史数据不参与当前趋势。当前demo未接AI，上线不强制采用；可选AI仅润色规则先得出的结论。</w:t>
       </w:r>
     </w:p>
     <w:p>
@@ -582,7 +582,7 @@
         <w:t>可选AI提示词：</w:t>
       </w:r>
       <w:r>
-        <w:t>根据已确认的报关方向、流量变化、库存变化及价差状态分别写短句，可写东向仍占优但流量放缓。保留各自日期，历史价差仅描述当时状态，不判断当前，不将库存或价差当作跨境迁移证明。 只润色已确认结论，不计算、补数据或编造因果。数字另行展示，地区名称统一为中国台湾。</w:t>
+        <w:t>根据已确认的报关方向、流量变化、库存变化及价差状态分别写短句，可写东向仍占优但流量放缓。保留各自日期，历史价差仅描述当时状态，不判断当前，不将库存或价差当作跨境迁移证明。 只润色已确认结论，不计算、补数据或编造因果。数字另行展示。</w:t>
       </w:r>
     </w:p>
     <w:p>
@@ -729,7 +729,7 @@
         <w:t>可选AI提示词：</w:t>
       </w:r>
       <w:r>
-        <w:t>根据已确认的净流入或净流出及与上月变化，写一句净流入扩大、净流出收窄或转为净流入。上月不完整只写本期状态，不把净进口等同于投资需求。 只润色已确认结论，不计算、补数据或编造因果。数字另行展示，地区名称统一为中国台湾。</w:t>
+        <w:t>根据已确认的净流入或净流出及与上月变化，写一句净流入扩大、净流出收窄或转为净流入。上月不完整只写本期状态，不把净进口等同于投资需求。 只润色已确认结论，不计算、补数据或编造因果。数字另行展示。</w:t>
       </w:r>
     </w:p>
     <w:p>
@@ -843,7 +843,7 @@
         <w:t>方向分组：</w:t>
       </w:r>
       <w:r>
-        <w:t>西方枢纽为瑞士、英国、美国；东方枢纽为中国香港、新加坡、阿联酋。东向目的地为孟加拉国、中国内地、中国香港、印尼、日本、韩国、马来西亚、其他亚洲地区（来源代码490）、巴基斯坦、印度、新加坡、越南、泰国。西向目的地为澳大利亚、奥地利、比利时、加拿大、法国、德国、意大利、荷兰、波兰、西班牙、瑞典、瑞士、英国、美国。按demo项目分组，前后期固定；代码490合并范围不当作中国台湾单独值。</w:t>
+        <w:t>西方枢纽为瑞士、英国、美国；东方枢纽为中国香港、新加坡、阿联酋。东向目的地为孟加拉国、中国内地、中国香港、印尼、日本、韩国、马来西亚、其他亚洲地区（来源代码490）、巴基斯坦、印度、新加坡、越南、泰国。西向目的地为澳大利亚、奥地利、比利时、加拿大、法国、德国、意大利、荷兰、波兰、西班牙、瑞典、瑞士、英国、美国。按demo项目分组，前后期固定；代码490按来源的合并范围处理，不拆分为单一地区值。</w:t>
       </w:r>
     </w:p>
     <w:p>
@@ -876,7 +876,7 @@
         <w:t>可选AI提示词：</w:t>
       </w:r>
       <w:r>
-        <w:t>根据已确认的主要目的地区域及相邻月份份额变化写一句路线判断。只有本期只写主要去向，可比才写重心转移；限定监测报关路线，不写全球黄金全面迁移。 只润色已确认结论，不计算、补数据或编造因果。数字另行展示，地区名称统一为中国台湾。</w:t>
+        <w:t>根据已确认的主要目的地区域及相邻月份份额变化写一句路线判断。只有本期只写主要去向，可比才写重心转移；限定监测报关路线，不写全球黄金全面迁移。 只润色已确认结论，不计算、补数据或编造因果。数字另行展示。</w:t>
       </w:r>
     </w:p>
     <w:p>
@@ -1201,7 +1201,7 @@
         <w:t>可选AI提示词：</w:t>
       </w:r>
       <w:r>
-        <w:t>分别概括瑞士进口主要来源和出口主要去向；只有可比份额变化才写倾斜或转移。保留两侧日期和范围，不把来源地角色当矿山产地，不以差额推库存。 只润色已确认结论，不计算、补数据或编造因果。数字另行展示，地区名称统一为中国台湾。</w:t>
+        <w:t>分别概括瑞士进口主要来源和出口主要去向；只有可比份额变化才写倾斜或转移。保留两侧日期和范围，不把来源地角色当矿山产地，不以差额推库存。 只润色已确认结论，不计算、补数据或编造因果。数字另行展示。</w:t>
       </w:r>
     </w:p>
     <w:p>
@@ -1655,7 +1655,7 @@
         <w:t>可选AI提示词：</w:t>
       </w:r>
       <w:r>
-        <w:t>分别描述已经确认的伦敦库存、COMEX库存、上海出库及监测报关变化。保留日期和指标含义，历史存档不参与当前趋势，不将不同指标相加或编造迁移因果。 只润色已确认结论，不计算、补数据或编造因果。数字另行展示，地区名称统一为中国台湾。</w:t>
+        <w:t>分别描述已经确认的伦敦库存、COMEX库存、上海出库及监测报关变化。保留日期和指标含义，历史存档不参与当前趋势，不将不同指标相加或编造迁移因果。 只润色已确认结论，不计算、补数据或编造因果。数字另行展示。</w:t>
       </w:r>
     </w:p>
     <w:p>
@@ -2047,7 +2047,7 @@
         <w:t>可选AI提示词：</w:t>
       </w:r>
       <w:r>
-        <w:t>根据同日已确认溢价或折价及上一共同日期变化写短句，优先上海溢价扩大、溢价收窄或转为折价。历史日期仅描述当时状态，不写当前结论，不解释为可实现运输套利。 只润色已确认结论，不计算、补数据或编造因果。数字另行展示，地区名称统一为中国台湾。</w:t>
+        <w:t>根据同日已确认溢价或折价及上一共同日期变化写短句，优先上海溢价扩大、溢价收窄或转为折价。历史日期仅描述当时状态，不写当前结论，不解释为可实现运输套利。 只润色已确认结论，不计算、补数据或编造因果。数字另行展示。</w:t>
       </w:r>
     </w:p>
     <w:p>

</xml_diff>